<commit_message>
Organiza arquiteturas 9-54 e 7-14 do curso
</commit_message>
<xml_diff>
--- a/70 - Produções/Cursos/Curso - Nome Provisório/10 - Raio X do Produto/Vigente/Raio-X-Fabiano Deliberalli.docx
+++ b/70 - Produções/Cursos/Curso - Nome Provisório/10 - Raio X do Produto/Vigente/Raio-X-Fabiano Deliberalli.docx
@@ -1037,21 +1037,76 @@
           <w:b/>
           <w:bCs/>
         </w:rPr>
-        <w:t xml:space="preserve">Aula </w:t>
-      </w:r>
-      <w:r>
-        <w:rPr>
-          <w:b/>
-          <w:bCs/>
-        </w:rPr>
-        <w:t>2</w:t>
-      </w:r>
-      <w:r>
-        <w:rPr>
-          <w:b/>
-          <w:bCs/>
-        </w:rPr>
-        <w:t xml:space="preserve"> — O que você precisa ter ou saber antes de começar</w:t>
+        <w:t>Aula 2 — Como usar o percurso, os mapas, as práticas e os materiais</w:t>
+      </w:r>
+      <w:r>
+        <w:rPr>
+          <w:b/>
+          <w:bCs/>
+        </w:rPr>
+      </w:r>
+      <w:r>
+        <w:rPr>
+          <w:b/>
+          <w:bCs/>
+        </w:rPr>
+      </w:r>
+    </w:p>
+    <w:p>
+      <w:pPr>
+        <w:spacing w:after="40" w:line="259" w:lineRule="auto"/>
+      </w:pPr>
+      <w:r>
+        <w:rPr>
+          <w:b/>
+        </w:rPr>
+        <w:t xml:space="preserve">Foco: </w:t>
+      </w:r>
+      <w:r>
+        <w:rPr>
+          <w:b w:val="0"/>
+        </w:rPr>
+        <w:t>Orientações para acompanhar as aulas, utilizar mapas, práticas e materiais de apoio e registrar o próprio percurso sem transformar o curso em nova cobrança.</w:t>
+      </w:r>
+    </w:p>
+    <w:p>
+      <w:pPr>
+        <w:keepNext/>
+        <w:keepLines/>
+        <w:spacing w:before="80" w:after="60"/>
+        <w:rPr>
+          <w:b/>
+          <w:bCs/>
+        </w:rPr>
+      </w:pPr>
+    </w:p>
+    <w:p>
+      <w:pPr>
+        <w:keepNext/>
+        <w:spacing w:before="120" w:after="40" w:line="259" w:lineRule="auto"/>
+        <w:rPr>
+          <w:b/>
+          <w:bCs/>
+        </w:rPr>
+      </w:pPr>
+      <w:r>
+        <w:rPr>
+          <w:b/>
+          <w:bCs/>
+        </w:rPr>
+        <w:t>Aula 3 — O que você precisa ter ou saber antes de começar</w:t>
+      </w:r>
+      <w:r>
+        <w:rPr>
+          <w:b/>
+          <w:bCs/>
+        </w:rPr>
+      </w:r>
+      <w:r>
+        <w:rPr>
+          <w:b/>
+          <w:bCs/>
+        </w:rPr>
       </w:r>
     </w:p>
     <w:p>

</xml_diff>

<commit_message>
Organiza arquiteturas 9/54 e 7/14 do curso
</commit_message>
<xml_diff>
--- a/70 - Produções/Cursos/Curso - Nome Provisório/10 - Raio X do Produto/Vigente/Raio-X-Fabiano Deliberalli.docx
+++ b/70 - Produções/Cursos/Curso - Nome Provisório/10 - Raio X do Produto/Vigente/Raio-X-Fabiano Deliberalli.docx
@@ -1037,21 +1037,76 @@
           <w:b/>
           <w:bCs/>
         </w:rPr>
-        <w:t xml:space="preserve">Aula </w:t>
-      </w:r>
-      <w:r>
-        <w:rPr>
-          <w:b/>
-          <w:bCs/>
-        </w:rPr>
-        <w:t>2</w:t>
-      </w:r>
-      <w:r>
-        <w:rPr>
-          <w:b/>
-          <w:bCs/>
-        </w:rPr>
-        <w:t xml:space="preserve"> — O que você precisa ter ou saber antes de começar</w:t>
+        <w:t>Aula 2 — Como usar o percurso, os mapas, as práticas e os materiais</w:t>
+      </w:r>
+      <w:r>
+        <w:rPr>
+          <w:b/>
+          <w:bCs/>
+        </w:rPr>
+      </w:r>
+      <w:r>
+        <w:rPr>
+          <w:b/>
+          <w:bCs/>
+        </w:rPr>
+      </w:r>
+    </w:p>
+    <w:p>
+      <w:pPr>
+        <w:spacing w:after="40" w:line="259" w:lineRule="auto"/>
+      </w:pPr>
+      <w:r>
+        <w:rPr>
+          <w:b/>
+        </w:rPr>
+        <w:t xml:space="preserve">Foco: </w:t>
+      </w:r>
+      <w:r>
+        <w:rPr>
+          <w:b w:val="0"/>
+        </w:rPr>
+        <w:t>Orientações para acompanhar as aulas, utilizar mapas, práticas e materiais de apoio e registrar o próprio percurso sem transformar o curso em nova cobrança.</w:t>
+      </w:r>
+    </w:p>
+    <w:p>
+      <w:pPr>
+        <w:keepNext/>
+        <w:keepLines/>
+        <w:spacing w:before="80" w:after="60"/>
+        <w:rPr>
+          <w:b/>
+          <w:bCs/>
+        </w:rPr>
+      </w:pPr>
+    </w:p>
+    <w:p>
+      <w:pPr>
+        <w:keepNext/>
+        <w:spacing w:before="120" w:after="40" w:line="259" w:lineRule="auto"/>
+        <w:rPr>
+          <w:b/>
+          <w:bCs/>
+        </w:rPr>
+      </w:pPr>
+      <w:r>
+        <w:rPr>
+          <w:b/>
+          <w:bCs/>
+        </w:rPr>
+        <w:t>Aula 3 — O que você precisa ter ou saber antes de começar</w:t>
+      </w:r>
+      <w:r>
+        <w:rPr>
+          <w:b/>
+          <w:bCs/>
+        </w:rPr>
+      </w:r>
+      <w:r>
+        <w:rPr>
+          <w:b/>
+          <w:bCs/>
+        </w:rPr>
       </w:r>
     </w:p>
     <w:p>

</xml_diff>